<commit_message>
brugervejledning og teknisk dokumentation opdateret og ajourført
</commit_message>
<xml_diff>
--- a/docs/Brugervejledning.docx
+++ b/docs/Brugervejledning.docx
@@ -924,7 +924,7 @@
                 <w:rFonts w:ascii="Arial" w:hAnsi="Arial"/>
                 <w:sz w:val="20"/>
               </w:rPr>
-              <w:t>Konfiguration af systemets masterdata: overenskomsttyper, overtidssatser, tillæg, løntypekoder (inkl. CSV-kolonneopsætning), fraværstyper, CVR-numre, helligdage, disponentgrupper og aftaletyper. Alle typer og koder kan oprettes, redigeres og slettes. Kræver 'Stamdata'-rettigheden.</w:t>
+              <w:t>Konfiguration af systemets masterdata: overenskomsttyper, overtidssatser, tillæg, løntypekoder (inkl. CSV-kolonneopsætning), fraværstyper, CVR-numre, helligdage, disponentgrupper, aftaletyper og auto-godkendelse (kapitel 17). Alle typer og koder kan oprettes, redigeres og slettes. Kræver 'Stamdata'-rettigheden.</w:t>
             </w:r>
           </w:p>
         </w:tc>
@@ -2066,6 +2066,50 @@
           </w:p>
         </w:tc>
       </w:tr>
+      <w:tr>
+        <w:tc>
+          <w:tcPr>
+            <w:tcW w:type="dxa" w:w="2835"/>
+            <w:shd w:val="clear" w:color="auto" w:fill="D5E8F5"/>
+            <w:tcBorders>
+              <w:top w:val="single" w:sz="4" w:color="9BBDD6"/>
+              <w:left w:val="single" w:sz="4" w:color="9BBDD6"/>
+              <w:bottom w:val="single" w:sz="4" w:color="9BBDD6"/>
+              <w:right w:val="single" w:sz="4" w:color="9BBDD6"/>
+            </w:tcBorders>
+          </w:tcPr>
+          <w:p>
+            <w:r>
+              <w:rPr>
+                <w:rFonts w:ascii="Arial" w:hAnsi="Arial"/>
+                <w:b/>
+                <w:sz w:val="20"/>
+              </w:rPr>
+              <w:t>● (lille prik)</w:t>
+            </w:r>
+          </w:p>
+        </w:tc>
+        <w:tc>
+          <w:tcPr>
+            <w:tcW w:type="dxa" w:w="6520"/>
+            <w:tcBorders>
+              <w:top w:val="single" w:sz="4" w:color="9BBDD6"/>
+              <w:left w:val="single" w:sz="4" w:color="9BBDD6"/>
+              <w:bottom w:val="single" w:sz="4" w:color="9BBDD6"/>
+              <w:right w:val="single" w:sz="4" w:color="9BBDD6"/>
+            </w:tcBorders>
+          </w:tcPr>
+          <w:p>
+            <w:r>
+              <w:rPr>
+                <w:rFonts w:ascii="Arial" w:hAnsi="Arial"/>
+                <w:sz w:val="20"/>
+              </w:rPr>
+              <w:t>Aktiviteten er auto-godkendt af systemet (statistisk baseline) – se kapitel 17.</w:t>
+            </w:r>
+          </w:p>
+        </w:tc>
+      </w:tr>
     </w:tbl>
     <w:p/>
     <w:p>
@@ -2613,6 +2657,50 @@
           </w:p>
         </w:tc>
       </w:tr>
+      <w:tr>
+        <w:tc>
+          <w:tcPr>
+            <w:tcW w:type="dxa" w:w="2835"/>
+            <w:shd w:val="clear" w:color="auto" w:fill="D5E8F5"/>
+            <w:tcBorders>
+              <w:top w:val="single" w:sz="4" w:color="9BBDD6"/>
+              <w:left w:val="single" w:sz="4" w:color="9BBDD6"/>
+              <w:bottom w:val="single" w:sz="4" w:color="9BBDD6"/>
+              <w:right w:val="single" w:sz="4" w:color="9BBDD6"/>
+            </w:tcBorders>
+          </w:tcPr>
+          <w:p>
+            <w:r>
+              <w:rPr>
+                <w:rFonts w:ascii="Arial" w:hAnsi="Arial"/>
+                <w:b/>
+                <w:sz w:val="20"/>
+              </w:rPr>
+              <w:t>Afvigelser registreret (ikke auto-godkendt)</w:t>
+            </w:r>
+          </w:p>
+        </w:tc>
+        <w:tc>
+          <w:tcPr>
+            <w:tcW w:type="dxa" w:w="6520"/>
+            <w:tcBorders>
+              <w:top w:val="single" w:sz="4" w:color="9BBDD6"/>
+              <w:left w:val="single" w:sz="4" w:color="9BBDD6"/>
+              <w:bottom w:val="single" w:sz="4" w:color="9BBDD6"/>
+              <w:right w:val="single" w:sz="4" w:color="9BBDD6"/>
+            </w:tcBorders>
+          </w:tcPr>
+          <w:p>
+            <w:r>
+              <w:rPr>
+                <w:rFonts w:ascii="Arial" w:hAnsi="Arial"/>
+                <w:sz w:val="20"/>
+              </w:rPr>
+              <w:t>Vises kun hvis aktiviteten IKKE blev auto-godkendt (kapitel 17) – lister præcis hvorfor (fx afvigende varighed eller starttid i forhold til medarbejderens sædvanlige mønster).</w:t>
+            </w:r>
+          </w:p>
+        </w:tc>
+      </w:tr>
     </w:tbl>
     <w:p/>
     <w:p>
@@ -2703,7 +2791,7 @@
           <w:b/>
           <w:sz w:val="22"/>
         </w:rPr>
-        <w:t>Godkend</w:t>
+        <w:t>Ret linje / Tilpas (i den detaljerede tidslinje)</w:t>
       </w:r>
     </w:p>
     <w:p>
@@ -2715,7 +2803,7 @@
           <w:rFonts w:ascii="Arial" w:hAnsi="Arial"/>
           <w:sz w:val="22"/>
         </w:rPr>
-        <w:t>Godkend aktiviteten så den indgår i lønkørslen. Angiv dine initialer. Aktiviteter under 4 timer kræver altid en kommentar.</w:t>
+        <w:t>Ud for et pausesegment (hvil) i den detaljerede tidslinje kan du klikke 'Ret linje' for at omklassificere det til 'Andet arbejde' – bruges fx hvis tachografen har registreret en pause der reelt var arbejde. En 'Gendan'-knap kan fortryde præcis den rettelse igen. 'Tilpas' åbner i stedet en dialog hvor du kan justere pausens sluttidspunkt (forlænge eller forkorte) uden at ændre dens type – en forhåndsvisning viser hvor mange minutter der flyttes, og fra/til hvilket segment. Begge dele påvirker den beregnede løn direkte, da et pausesegment der bliver til arbejde tæller med i timerne.</w:t>
       </w:r>
     </w:p>
     <w:p>
@@ -2725,12 +2813,34 @@
           <w:b/>
           <w:sz w:val="22"/>
         </w:rPr>
-        <w:t>Deaktiver</w:t>
+        <w:t>Godkend</w:t>
       </w:r>
     </w:p>
     <w:p>
       <w:pPr>
-        <w:spacing w:after="160"/>
+        <w:spacing w:after="80"/>
+      </w:pPr>
+      <w:r>
+        <w:rPr>
+          <w:rFonts w:ascii="Arial" w:hAnsi="Arial"/>
+          <w:sz w:val="22"/>
+        </w:rPr>
+        <w:t>Godkend aktiviteten så den indgår i lønkørslen. Angiv dine initialer. Aktiviteter under 4 timer kræver altid en kommentar.</w:t>
+      </w:r>
+    </w:p>
+    <w:p>
+      <w:r>
+        <w:rPr>
+          <w:rFonts w:ascii="Arial" w:hAnsi="Arial"/>
+          <w:b/>
+          <w:sz w:val="22"/>
+        </w:rPr>
+        <w:t>Deaktiver</w:t>
+      </w:r>
+    </w:p>
+    <w:p>
+      <w:pPr>
+        <w:spacing w:after="80"/>
       </w:pPr>
       <w:r>
         <w:rPr>
@@ -2760,6 +2870,29 @@
           <w:color w:val="606060"/>
           <w:sz w:val="22"/>
         </w:rPr>
+        <w:t>Deaktiver-dialogen har et ekstra flueben 'Slet aktiviteten helt', som sletter aktiviteten PERMANENT i stedet for blot at deaktivere den – kan ikke fortrydes. Fluebenet er kun tilgængeligt for fraværstyper (altid) og for manuelt oprettet normal tid – en takograf-importeret kørselsaktivitet kan aldrig slettes helt, kun deaktiveres, fordi den er rå kørselsdata fra førerkortet. Brug det med omtanke: der er ingen 'Gendan' for en permanent slettet aktivitet.</w:t>
+      </w:r>
+    </w:p>
+    <w:p>
+      <w:pPr>
+        <w:spacing w:before="80" w:after="160"/>
+        <w:ind w:left="283" w:right="283"/>
+      </w:pPr>
+      <w:r>
+        <w:rPr>
+          <w:rFonts w:ascii="Arial" w:hAnsi="Arial"/>
+          <w:b/>
+          <w:color w:val="2E6DB8"/>
+          <w:sz w:val="22"/>
+        </w:rPr>
+        <w:t xml:space="preserve">VIGTIGT: </w:t>
+      </w:r>
+      <w:r>
+        <w:rPr>
+          <w:rFonts w:ascii="Arial" w:hAnsi="Arial"/>
+          <w:color w:val="606060"/>
+          <w:sz w:val="22"/>
+        </w:rPr>
         <w:t>KUN godkendte aktiviteter medtages i lønkørslen. Husk at gennemgå og godkende alle relevante aktiviteter inden du kører løn.</w:t>
       </w:r>
     </w:p>
@@ -2792,6 +2925,29 @@
     </w:p>
     <w:p>
       <w:pPr>
+        <w:spacing w:before="80" w:after="160"/>
+        <w:ind w:left="283" w:right="283"/>
+      </w:pPr>
+      <w:r>
+        <w:rPr>
+          <w:rFonts w:ascii="Arial" w:hAnsi="Arial"/>
+          <w:b/>
+          <w:color w:val="2E6DB8"/>
+          <w:sz w:val="22"/>
+        </w:rPr>
+        <w:t xml:space="preserve">GODT AT VIDE: </w:t>
+      </w:r>
+      <w:r>
+        <w:rPr>
+          <w:rFonts w:ascii="Arial" w:hAnsi="Arial"/>
+          <w:color w:val="606060"/>
+          <w:sz w:val="22"/>
+        </w:rPr>
+        <w:t>Har din rolle rettigheden 'Auto-godkend ved oprettelse' (se rettighedsoversigten, kapitel 11), bliver de aktiviteter DU opretter manuelt godkendt med det samme, uden det sædvanlige 'Afventer'-trin. Ikke at forveksle med den statistiske auto-godkendelse i kapitel 17, som kun gælder tachograf-importerede kørselsdage.</w:t>
+      </w:r>
+    </w:p>
+    <w:p>
+      <w:pPr>
         <w:pStyle w:val="Heading2"/>
         <w:spacing w:before="200" w:after="120"/>
       </w:pPr>
@@ -2935,6 +3091,52 @@
           <w:sz w:val="22"/>
         </w:rPr>
         <w:t>Klik 'Gem aktivitet'.</w:t>
+      </w:r>
+    </w:p>
+    <w:p>
+      <w:pPr>
+        <w:spacing w:before="80" w:after="160"/>
+        <w:ind w:left="283" w:right="283"/>
+      </w:pPr>
+      <w:r>
+        <w:rPr>
+          <w:rFonts w:ascii="Arial" w:hAnsi="Arial"/>
+          <w:b/>
+          <w:color w:val="2E6DB8"/>
+          <w:sz w:val="22"/>
+        </w:rPr>
+        <w:t xml:space="preserve">BEMÆRK: </w:t>
+      </w:r>
+      <w:r>
+        <w:rPr>
+          <w:rFonts w:ascii="Arial" w:hAnsi="Arial"/>
+          <w:color w:val="606060"/>
+          <w:sz w:val="22"/>
+        </w:rPr>
+        <w:t>Vognnummer/registreringsnummer er PÅKRÆVET for alle aktivitetstyper undtagen overnatning – også for fraværstyper. Feltet valideres mod Vognparken: stemmer det ikke med et kendt vognnummer, viser systemet 'Ukendt registreringsnummer' og beder dig oprette køretøjet i Vognpark først, i stedet for at gemme aktiviteten.</w:t>
+      </w:r>
+    </w:p>
+    <w:p>
+      <w:pPr>
+        <w:spacing w:before="80" w:after="160"/>
+        <w:ind w:left="283" w:right="283"/>
+      </w:pPr>
+      <w:r>
+        <w:rPr>
+          <w:rFonts w:ascii="Arial" w:hAnsi="Arial"/>
+          <w:b/>
+          <w:color w:val="2E6DB8"/>
+          <w:sz w:val="22"/>
+        </w:rPr>
+        <w:t xml:space="preserve">BEMÆRK: </w:t>
+      </w:r>
+      <w:r>
+        <w:rPr>
+          <w:rFonts w:ascii="Arial" w:hAnsi="Arial"/>
+          <w:color w:val="606060"/>
+          <w:sz w:val="22"/>
+        </w:rPr>
+        <w:t>Registrerer du en fraværstype på en dag hvor medarbejderen allerede har en kørsel ('normal tid') registreret, viser systemet en advarsel med de(n) berørte dato(er) og spørger om du vil fortsætte alligevel. Vælg 'Annuller' for at rette datoen, eller 'Fortsæt alligevel' hvis begge registreringer skal stå.</w:t>
       </w:r>
     </w:p>
     <w:p>
@@ -3288,10 +3490,129 @@
           </w:p>
         </w:tc>
       </w:tr>
+      <w:tr>
+        <w:tc>
+          <w:tcPr>
+            <w:tcW w:type="dxa" w:w="4536"/>
+            <w:tcBorders>
+              <w:top w:val="single" w:sz="4" w:color="CCCCCC"/>
+              <w:left w:val="single" w:sz="4" w:color="CCCCCC"/>
+              <w:bottom w:val="single" w:sz="4" w:color="CCCCCC"/>
+              <w:right w:val="single" w:sz="4" w:color="CCCCCC"/>
+            </w:tcBorders>
+          </w:tcPr>
+          <w:p>
+            <w:r>
+              <w:rPr>
+                <w:rFonts w:ascii="Arial" w:hAnsi="Arial"/>
+                <w:sz w:val="20"/>
+              </w:rPr>
+              <w:t>Overnatning – DOB</w:t>
+            </w:r>
+          </w:p>
+        </w:tc>
+        <w:tc>
+          <w:tcPr>
+            <w:tcW w:type="dxa" w:w="4536"/>
+            <w:tcBorders>
+              <w:top w:val="single" w:sz="4" w:color="CCCCCC"/>
+              <w:left w:val="single" w:sz="4" w:color="CCCCCC"/>
+              <w:bottom w:val="single" w:sz="4" w:color="CCCCCC"/>
+              <w:right w:val="single" w:sz="4" w:color="CCCCCC"/>
+            </w:tcBorders>
+          </w:tcPr>
+          <w:p>
+            <w:r>
+              <w:rPr>
+                <w:rFonts w:ascii="Arial" w:hAnsi="Arial"/>
+                <w:sz w:val="20"/>
+              </w:rPr>
+              <w:t>Krydses af INDE I Overnatning-oprettelsen (samme modal, ekstra 'DOB'-flueben) – registreres som en separat overnatningstype med sin egen sats i Stamdata → Tillæg. Vises som egen linje i PDF-timesedlen og prøvekørslens Excel-ark, men indgår PT. IKKE i Danløn CSV-eksporten.</w:t>
+            </w:r>
+          </w:p>
+        </w:tc>
+      </w:tr>
     </w:tbl>
     <w:p/>
     <w:p>
       <w:pPr>
+        <w:spacing w:after="120"/>
+      </w:pPr>
+      <w:r>
+        <w:rPr>
+          <w:rFonts w:ascii="Arial" w:hAnsi="Arial"/>
+          <w:sz w:val="22"/>
+        </w:rPr>
+        <w:t>Sygdom, Barn 1.sygedag og Barsel omklassificeres automatisk til en ulønnet variant, hvis medarbejderens anciennitet er for lav på registreringstidspunktet – du behøver ikke gøre noget aktivt, systemet vælger den rigtige type for dig:</w:t>
+      </w:r>
+    </w:p>
+    <w:p>
+      <w:pPr>
+        <w:pStyle w:val="ListBullet"/>
+        <w:spacing w:after="40"/>
+        <w:ind w:left="454"/>
+      </w:pPr>
+      <w:r>
+        <w:rPr>
+          <w:rFonts w:ascii="Arial" w:hAnsi="Arial"/>
+          <w:sz w:val="22"/>
+        </w:rPr>
+        <w:t>Sygdom → 'Sygdom u. 8 uger' hvis medarbejderen har været ansat 8 uger eller mindre på sygedagen.</w:t>
+      </w:r>
+    </w:p>
+    <w:p>
+      <w:pPr>
+        <w:pStyle w:val="ListBullet"/>
+        <w:spacing w:after="40"/>
+        <w:ind w:left="454"/>
+      </w:pPr>
+      <w:r>
+        <w:rPr>
+          <w:rFonts w:ascii="Arial" w:hAnsi="Arial"/>
+          <w:sz w:val="22"/>
+        </w:rPr>
+        <w:t>Barn 1.sygedag → 'Barn 1.sygedag u. 8 uger' hvis medarbejderen har under 9 måneders anciennitet.</w:t>
+      </w:r>
+    </w:p>
+    <w:p>
+      <w:pPr>
+        <w:pStyle w:val="ListBullet"/>
+        <w:spacing w:after="40"/>
+        <w:ind w:left="454"/>
+      </w:pPr>
+      <w:r>
+        <w:rPr>
+          <w:rFonts w:ascii="Arial" w:hAnsi="Arial"/>
+          <w:sz w:val="22"/>
+        </w:rPr>
+        <w:t>Barsel → 'Barsel u. løn' hvis medarbejderen har under 9 måneders anciennitet regnet fra terminsdatoen (se nedenfor), ikke fra selve barselsdagen.</w:t>
+      </w:r>
+    </w:p>
+    <w:p>
+      <w:pPr>
+        <w:spacing w:before="80" w:after="160"/>
+        <w:ind w:left="283" w:right="283"/>
+      </w:pPr>
+      <w:r>
+        <w:rPr>
+          <w:rFonts w:ascii="Arial" w:hAnsi="Arial"/>
+          <w:b/>
+          <w:color w:val="2E6DB8"/>
+          <w:sz w:val="22"/>
+        </w:rPr>
+        <w:t xml:space="preserve">BEMÆRK: </w:t>
+      </w:r>
+      <w:r>
+        <w:rPr>
+          <w:rFonts w:ascii="Arial" w:hAnsi="Arial"/>
+          <w:color w:val="606060"/>
+          <w:sz w:val="22"/>
+        </w:rPr>
+        <w:t>Ved oprettelse af en barsel-aktivitet skal du angive medarbejderens 'Terminsdato' (forventet fødselsdato) – uden den kan aktiviteten ikke gemmes. Terminsdatoen huskes på medarbejderen, så du ikke skal indtaste den igen næste gang.</w:t>
+      </w:r>
+    </w:p>
+    <w:p>
+      <w:pPr>
         <w:pStyle w:val="Heading2"/>
         <w:spacing w:before="200" w:after="120"/>
       </w:pPr>
@@ -3502,6 +3823,84 @@
           <w:sz w:val="22"/>
         </w:rPr>
         <w:t>Lønberegning – pauser fratrækkes i det præcise tidsvindue de afholdes, så overtidstillæg beregnes korrekt.</w:t>
+      </w:r>
+    </w:p>
+    <w:p>
+      <w:pPr>
+        <w:pStyle w:val="Heading2"/>
+        <w:spacing w:before="200" w:after="120"/>
+      </w:pPr>
+      <w:r>
+        <w:rPr>
+          <w:rFonts w:ascii="Arial" w:hAnsi="Arial"/>
+          <w:b/>
+          <w:color w:val="2E6DB8"/>
+          <w:sz w:val="26"/>
+        </w:rPr>
+        <w:t>6.4  Redigering af en fraværsperiode</w:t>
+      </w:r>
+    </w:p>
+    <w:p>
+      <w:pPr>
+        <w:spacing w:after="120"/>
+      </w:pPr>
+      <w:r>
+        <w:rPr>
+          <w:rFonts w:ascii="Arial" w:hAnsi="Arial"/>
+          <w:sz w:val="22"/>
+        </w:rPr>
+        <w:t>Har du oprettet en flerdags-fraværsperiode (med 'Til dato'), kan du efterfølgende udvide eller forkorte den, uden at slette og genoprette alt: åbn en hvilken som helst dag i perioden, og en 'Fraværsperiode'-boks øverst i detaljevisningen lader dig ændre 'Fra dato' og/eller 'Til dato'. Klik 'Gem periodedatoer' for at gennemføre ændringen.</w:t>
+      </w:r>
+    </w:p>
+    <w:p>
+      <w:pPr>
+        <w:pStyle w:val="ListBullet"/>
+        <w:spacing w:after="40"/>
+        <w:ind w:left="454"/>
+      </w:pPr>
+      <w:r>
+        <w:rPr>
+          <w:rFonts w:ascii="Arial" w:hAnsi="Arial"/>
+          <w:sz w:val="22"/>
+        </w:rPr>
+        <w:t>Dage der TILFØJES til perioden, får en ny aktivitet med samme standardtimer som ved oprettelse. Har medarbejderen 0 skemalagte timer den ugedag, springes dagen automatisk over.</w:t>
+      </w:r>
+    </w:p>
+    <w:p>
+      <w:pPr>
+        <w:pStyle w:val="ListBullet"/>
+        <w:spacing w:after="40"/>
+        <w:ind w:left="454"/>
+      </w:pPr>
+      <w:r>
+        <w:rPr>
+          <w:rFonts w:ascii="Arial" w:hAnsi="Arial"/>
+          <w:sz w:val="22"/>
+        </w:rPr>
+        <w:t>Dage der FJERNES fra perioden, bliver PERMANENT slettet – ikke deaktiveret. Systemet viser altid en opsummering ('N dage slettes permanent / N dage oprettes') til bekræftelse, før noget gennemføres.</w:t>
+      </w:r>
+    </w:p>
+    <w:p>
+      <w:pPr>
+        <w:spacing w:before="80" w:after="160"/>
+        <w:ind w:left="283" w:right="283"/>
+      </w:pPr>
+      <w:r>
+        <w:rPr>
+          <w:rFonts w:ascii="Arial" w:hAnsi="Arial"/>
+          <w:b/>
+          <w:color w:val="2E6DB8"/>
+          <w:sz w:val="22"/>
+        </w:rPr>
+        <w:t xml:space="preserve">BEMÆRK: </w:t>
+      </w:r>
+      <w:r>
+        <w:rPr>
+          <w:rFonts w:ascii="Arial" w:hAnsi="Arial"/>
+          <w:color w:val="606060"/>
+          <w:sz w:val="22"/>
+        </w:rPr>
+        <w:t>Er en af dagene der skal fjernes i en lønperiode der allerede er kørt løn på ('Lukket'), afvises hele ændringen – ingen dage fjernes, før perioden evt. genåbnes. Det samme gælder hvis en af dagene er blevet opdelt (split) – fortryd splittet først.</w:t>
       </w:r>
     </w:p>
     <w:p>
@@ -4088,6 +4487,68 @@
                 <w:sz w:val="20"/>
               </w:rPr>
               <w:t>Afkryd for en afløser/substitutmedarbejder. Medarbejderen får IKKE søgnehelligdagsbetaling (kode 4/63) på søndage/helligdage medmindre vedkommende faktisk har kørt den dag – se afsnit 9.5. Farvemarkeres separat i medarbejderlisten, Vagtplan og Aktivitetsoversigten.</w:t>
+            </w:r>
+          </w:p>
+        </w:tc>
+      </w:tr>
+      <w:tr>
+        <w:tc>
+          <w:tcPr>
+            <w:tcW w:type="dxa" w:w="3024"/>
+            <w:tcBorders>
+              <w:top w:val="single" w:sz="4" w:color="CCCCCC"/>
+              <w:left w:val="single" w:sz="4" w:color="CCCCCC"/>
+              <w:bottom w:val="single" w:sz="4" w:color="CCCCCC"/>
+              <w:right w:val="single" w:sz="4" w:color="CCCCCC"/>
+            </w:tcBorders>
+          </w:tcPr>
+          <w:p>
+            <w:r>
+              <w:rPr>
+                <w:rFonts w:ascii="Arial" w:hAnsi="Arial"/>
+                <w:sz w:val="20"/>
+              </w:rPr>
+              <w:t>CVR-nummer</w:t>
+            </w:r>
+          </w:p>
+        </w:tc>
+        <w:tc>
+          <w:tcPr>
+            <w:tcW w:type="dxa" w:w="3024"/>
+            <w:tcBorders>
+              <w:top w:val="single" w:sz="4" w:color="CCCCCC"/>
+              <w:left w:val="single" w:sz="4" w:color="CCCCCC"/>
+              <w:bottom w:val="single" w:sz="4" w:color="CCCCCC"/>
+              <w:right w:val="single" w:sz="4" w:color="CCCCCC"/>
+            </w:tcBorders>
+          </w:tcPr>
+          <w:p>
+            <w:r>
+              <w:rPr>
+                <w:rFonts w:ascii="Arial" w:hAnsi="Arial"/>
+                <w:sz w:val="20"/>
+              </w:rPr>
+              <w:t>Nej</w:t>
+            </w:r>
+          </w:p>
+        </w:tc>
+        <w:tc>
+          <w:tcPr>
+            <w:tcW w:type="dxa" w:w="3024"/>
+            <w:tcBorders>
+              <w:top w:val="single" w:sz="4" w:color="CCCCCC"/>
+              <w:left w:val="single" w:sz="4" w:color="CCCCCC"/>
+              <w:bottom w:val="single" w:sz="4" w:color="CCCCCC"/>
+              <w:right w:val="single" w:sz="4" w:color="CCCCCC"/>
+            </w:tcBorders>
+          </w:tcPr>
+          <w:p>
+            <w:r>
+              <w:rPr>
+                <w:rFonts w:ascii="Arial" w:hAnsi="Arial"/>
+                <w:sz w:val="20"/>
+              </w:rPr>
+              <w:t>Kun synligt hvis der er oprettet 2 eller flere CVR-numre i Stamdata → CVR nummer. Vælger hvilket CVR-nummer medarbejderens Danløn-eksport og PDF-timeseddel skal bruge. Tomt/skjult felt = medarbejderen bruger automatisk standard-CVR'et.</w:t>
             </w:r>
           </w:p>
         </w:tc>
@@ -11896,6 +12357,309 @@
         <w:t>Nyoprettede vogne har som udgangspunkt IKKE fluebenet 'Vognpark' sat og vises derfor ikke i Dagsplan, før du aktivt går ind under fanen 'Alle' og krydser feltet af. 'Meld materielt fravær' (kapitel 13.2) og medarbejder-modalens 'Fast bil'-søgning viser i øvrigt alle vogne uanset dette flueben.</w:t>
       </w:r>
     </w:p>
+    <w:p>
+      <w:r>
+        <w:br w:type="page"/>
+      </w:r>
+    </w:p>
+    <w:p>
+      <w:pPr>
+        <w:pStyle w:val="Heading1"/>
+        <w:spacing w:before="360" w:after="120"/>
+      </w:pPr>
+      <w:r>
+        <w:rPr>
+          <w:rFonts w:ascii="Arial" w:hAnsi="Arial"/>
+          <w:b/>
+          <w:color w:val="1B3A6B"/>
+          <w:sz w:val="32"/>
+        </w:rPr>
+        <w:t>17  Auto-godkendelse</w:t>
+      </w:r>
+    </w:p>
+    <w:p>
+      <w:pPr>
+        <w:spacing w:after="120"/>
+      </w:pPr>
+      <w:r>
+        <w:rPr>
+          <w:rFonts w:ascii="Arial" w:hAnsi="Arial"/>
+          <w:sz w:val="22"/>
+        </w:rPr>
+        <w:t>Systemet kan automatisk godkende kørselsdage der er importeret fra tachografen (.ddd-filer), hvis de ligner medarbejderens sædvanlige mønster for den pågældende ugedag. Dette er UAFHÆNGIGT af 'Auto-godkend ved oprettelse'-rettigheden (kapitel 6), som handler om manuelt oprettede aktiviteter – de to må ikke forveksles.</w:t>
+      </w:r>
+    </w:p>
+    <w:p>
+      <w:pPr>
+        <w:spacing w:before="80" w:after="160"/>
+        <w:ind w:left="283" w:right="283"/>
+      </w:pPr>
+      <w:r>
+        <w:rPr>
+          <w:rFonts w:ascii="Arial" w:hAnsi="Arial"/>
+          <w:b/>
+          <w:color w:val="2E6DB8"/>
+          <w:sz w:val="22"/>
+        </w:rPr>
+        <w:t xml:space="preserve">BEMÆRK: </w:t>
+      </w:r>
+      <w:r>
+        <w:rPr>
+          <w:rFonts w:ascii="Arial" w:hAnsi="Arial"/>
+          <w:color w:val="606060"/>
+          <w:sz w:val="22"/>
+        </w:rPr>
+        <w:t>Kun kørselsdage fra tachografimport kan blive auto-godkendt af denne funktion. Manuelt oprettede aktiviteter og fraværstyper er slet ikke i spil her.</w:t>
+      </w:r>
+    </w:p>
+    <w:p>
+      <w:pPr>
+        <w:pStyle w:val="Heading2"/>
+        <w:spacing w:before="200" w:after="120"/>
+      </w:pPr>
+      <w:r>
+        <w:rPr>
+          <w:rFonts w:ascii="Arial" w:hAnsi="Arial"/>
+          <w:b/>
+          <w:color w:val="2E6DB8"/>
+          <w:sz w:val="26"/>
+        </w:rPr>
+        <w:t>17.1  Hvordan afgøres det?</w:t>
+      </w:r>
+    </w:p>
+    <w:p>
+      <w:pPr>
+        <w:spacing w:after="120"/>
+      </w:pPr>
+      <w:r>
+        <w:rPr>
+          <w:rFonts w:ascii="Arial" w:hAnsi="Arial"/>
+          <w:sz w:val="22"/>
+        </w:rPr>
+        <w:t>For hver medarbejder og ugedag (mandag til søndag hver for sig) husker systemet det typiske mønster – gennemsnitlig varighed og starttidspunkt, baseret på tidligere godkendte dage. En ny kørselsdag godkendes automatisk, hvis BÅDE varighed og starttid ligger tæt nok på dette mønster. Er der endnu ikke registreret mindst 5 tidligere dage for den ugedag, godkendes dagen ikke automatisk ('Ikke nok data').</w:t>
+      </w:r>
+    </w:p>
+    <w:p>
+      <w:pPr>
+        <w:spacing w:after="120"/>
+      </w:pPr>
+      <w:r>
+        <w:rPr>
+          <w:rFonts w:ascii="Arial" w:hAnsi="Arial"/>
+          <w:sz w:val="22"/>
+        </w:rPr>
+        <w:t>Afviger dagen for meget, bliver den IKKE auto-godkendt – den forbliver 'Afventer' som normalt, og skal godkendes manuelt ligesom hidtil. Årsagen til afvisningen vises i aktivitetsdetaljen under 'Afvigelser registreret (ikke auto-godkendt)' (afsnit 5.1), så du kan se præcis hvad der afveg.</w:t>
+      </w:r>
+    </w:p>
+    <w:p>
+      <w:pPr>
+        <w:pStyle w:val="Heading2"/>
+        <w:spacing w:before="200" w:after="120"/>
+      </w:pPr>
+      <w:r>
+        <w:rPr>
+          <w:rFonts w:ascii="Arial" w:hAnsi="Arial"/>
+          <w:b/>
+          <w:color w:val="2E6DB8"/>
+          <w:sz w:val="26"/>
+        </w:rPr>
+        <w:t>17.2  Sådan ser du det i praksis</w:t>
+      </w:r>
+    </w:p>
+    <w:tbl>
+      <w:tblPr>
+        <w:tblStyle w:val="TableGrid"/>
+        <w:tblW w:type="auto" w:w="0"/>
+        <w:tblLook w:firstColumn="1" w:firstRow="1" w:lastColumn="0" w:lastRow="0" w:noHBand="0" w:noVBand="1" w:val="04A0"/>
+      </w:tblPr>
+      <w:tblGrid>
+        <w:gridCol w:w="4536"/>
+        <w:gridCol w:w="4536"/>
+      </w:tblGrid>
+      <w:tr>
+        <w:tc>
+          <w:tcPr>
+            <w:tcW w:type="dxa" w:w="2835"/>
+            <w:shd w:val="clear" w:color="auto" w:fill="D5E8F5"/>
+            <w:tcBorders>
+              <w:top w:val="single" w:sz="4" w:color="9BBDD6"/>
+              <w:left w:val="single" w:sz="4" w:color="9BBDD6"/>
+              <w:bottom w:val="single" w:sz="4" w:color="9BBDD6"/>
+              <w:right w:val="single" w:sz="4" w:color="9BBDD6"/>
+            </w:tcBorders>
+          </w:tcPr>
+          <w:p>
+            <w:r>
+              <w:rPr>
+                <w:rFonts w:ascii="Arial" w:hAnsi="Arial"/>
+                <w:b/>
+                <w:sz w:val="20"/>
+              </w:rPr>
+              <w:t>Lille prik ved klokkeslættet</w:t>
+            </w:r>
+          </w:p>
+        </w:tc>
+        <w:tc>
+          <w:tcPr>
+            <w:tcW w:type="dxa" w:w="6520"/>
+            <w:tcBorders>
+              <w:top w:val="single" w:sz="4" w:color="9BBDD6"/>
+              <w:left w:val="single" w:sz="4" w:color="9BBDD6"/>
+              <w:bottom w:val="single" w:sz="4" w:color="9BBDD6"/>
+              <w:right w:val="single" w:sz="4" w:color="9BBDD6"/>
+            </w:tcBorders>
+          </w:tcPr>
+          <w:p>
+            <w:r>
+              <w:rPr>
+                <w:rFonts w:ascii="Arial" w:hAnsi="Arial"/>
+                <w:sz w:val="20"/>
+              </w:rPr>
+              <w:t>Aktiviteten er auto-godkendt (status 'Godkendt' uden manuel handling).</w:t>
+            </w:r>
+          </w:p>
+        </w:tc>
+      </w:tr>
+      <w:tr>
+        <w:tc>
+          <w:tcPr>
+            <w:tcW w:type="dxa" w:w="2835"/>
+            <w:shd w:val="clear" w:color="auto" w:fill="D5E8F5"/>
+            <w:tcBorders>
+              <w:top w:val="single" w:sz="4" w:color="9BBDD6"/>
+              <w:left w:val="single" w:sz="4" w:color="9BBDD6"/>
+              <w:bottom w:val="single" w:sz="4" w:color="9BBDD6"/>
+              <w:right w:val="single" w:sz="4" w:color="9BBDD6"/>
+            </w:tcBorders>
+          </w:tcPr>
+          <w:p>
+            <w:r>
+              <w:rPr>
+                <w:rFonts w:ascii="Arial" w:hAnsi="Arial"/>
+                <w:b/>
+                <w:sz w:val="20"/>
+              </w:rPr>
+              <w:t>'Autogodkend aktiviteter'-knap</w:t>
+            </w:r>
+          </w:p>
+        </w:tc>
+        <w:tc>
+          <w:tcPr>
+            <w:tcW w:type="dxa" w:w="6520"/>
+            <w:tcBorders>
+              <w:top w:val="single" w:sz="4" w:color="9BBDD6"/>
+              <w:left w:val="single" w:sz="4" w:color="9BBDD6"/>
+              <w:bottom w:val="single" w:sz="4" w:color="9BBDD6"/>
+              <w:right w:val="single" w:sz="4" w:color="9BBDD6"/>
+            </w:tcBorders>
+          </w:tcPr>
+          <w:p>
+            <w:r>
+              <w:rPr>
+                <w:rFonts w:ascii="Arial" w:hAnsi="Arial"/>
+                <w:sz w:val="20"/>
+              </w:rPr>
+              <w:t>I aktivitetstabellens værktøjslinje – gennemgår alle afventende kørselsdage i den viste periode og godkender dem der matcher mønsteret. Resten flages til manuel gennemgang. Vises kun når funktionen er slået til (se nedenfor).</w:t>
+            </w:r>
+          </w:p>
+        </w:tc>
+      </w:tr>
+      <w:tr>
+        <w:tc>
+          <w:tcPr>
+            <w:tcW w:type="dxa" w:w="2835"/>
+            <w:shd w:val="clear" w:color="auto" w:fill="D5E8F5"/>
+            <w:tcBorders>
+              <w:top w:val="single" w:sz="4" w:color="9BBDD6"/>
+              <w:left w:val="single" w:sz="4" w:color="9BBDD6"/>
+              <w:bottom w:val="single" w:sz="4" w:color="9BBDD6"/>
+              <w:right w:val="single" w:sz="4" w:color="9BBDD6"/>
+            </w:tcBorders>
+          </w:tcPr>
+          <w:p>
+            <w:r>
+              <w:rPr>
+                <w:rFonts w:ascii="Arial" w:hAnsi="Arial"/>
+                <w:b/>
+                <w:sz w:val="20"/>
+              </w:rPr>
+              <w:t>'Afvigelser registreret'</w:t>
+            </w:r>
+          </w:p>
+        </w:tc>
+        <w:tc>
+          <w:tcPr>
+            <w:tcW w:type="dxa" w:w="6520"/>
+            <w:tcBorders>
+              <w:top w:val="single" w:sz="4" w:color="9BBDD6"/>
+              <w:left w:val="single" w:sz="4" w:color="9BBDD6"/>
+              <w:bottom w:val="single" w:sz="4" w:color="9BBDD6"/>
+              <w:right w:val="single" w:sz="4" w:color="9BBDD6"/>
+            </w:tcBorders>
+          </w:tcPr>
+          <w:p>
+            <w:r>
+              <w:rPr>
+                <w:rFonts w:ascii="Arial" w:hAnsi="Arial"/>
+                <w:sz w:val="20"/>
+              </w:rPr>
+              <w:t>I aktivitetsdetaljen for en dag der IKKE blev auto-godkendt – forklarer hvorfor (afsnit 5.1).</w:t>
+            </w:r>
+          </w:p>
+        </w:tc>
+      </w:tr>
+    </w:tbl>
+    <w:p/>
+    <w:p>
+      <w:pPr>
+        <w:pStyle w:val="Heading2"/>
+        <w:spacing w:before="200" w:after="120"/>
+      </w:pPr>
+      <w:r>
+        <w:rPr>
+          <w:rFonts w:ascii="Arial" w:hAnsi="Arial"/>
+          <w:b/>
+          <w:color w:val="2E6DB8"/>
+          <w:sz w:val="26"/>
+        </w:rPr>
+        <w:t>17.3  Global til/fra-kontakt</w:t>
+      </w:r>
+    </w:p>
+    <w:p>
+      <w:pPr>
+        <w:spacing w:after="120"/>
+      </w:pPr>
+      <w:r>
+        <w:rPr>
+          <w:rFonts w:ascii="Arial" w:hAnsi="Arial"/>
+          <w:sz w:val="22"/>
+        </w:rPr>
+        <w:t>Under Stamdata → 'Auto-godkendelse' kan brugere med rettigheden 'Slå auto-godkendelse til/fra' se status og slå hele funktionen til eller fra for alle medarbejdere på én gang. Er den slået fra, godkendes intet automatisk – hverken ved import eller via 'Autogodkend aktiviteter'-knappen (som så også er skjult), og alle kørselsdage skal godkendes manuelt som før funktionen fandtes.</w:t>
+      </w:r>
+    </w:p>
+    <w:p>
+      <w:pPr>
+        <w:spacing w:before="80" w:after="160"/>
+        <w:ind w:left="283" w:right="283"/>
+      </w:pPr>
+      <w:r>
+        <w:rPr>
+          <w:rFonts w:ascii="Arial" w:hAnsi="Arial"/>
+          <w:b/>
+          <w:color w:val="2E6DB8"/>
+          <w:sz w:val="22"/>
+        </w:rPr>
+        <w:t xml:space="preserve">BEMÆRK: </w:t>
+      </w:r>
+      <w:r>
+        <w:rPr>
+          <w:rFonts w:ascii="Arial" w:hAnsi="Arial"/>
+          <w:color w:val="606060"/>
+          <w:sz w:val="22"/>
+        </w:rPr>
+        <w:t>Kontakten påvirker KUN denne statistiske auto-godkendelse. Den har ingen indflydelse på 'Auto-godkend ved oprettelse' (manuelle aktiviteter, kapitel 6) eller på fraværstypers uændrede automatiske godkendelse ved oprettelse.</w:t>
+      </w:r>
+    </w:p>
     <w:sectPr>
       <w:pgSz w:w="11906" w:h="16838"/>
       <w:pgMar w:top="1417" w:right="1417" w:bottom="1417" w:left="1417" w:header="720" w:footer="720" w:gutter="0"/>

</xml_diff>

<commit_message>
brugervejledning og teknisk dokumnetation er opdateret med nyeste rettelser/tilføjelser.
</commit_message>
<xml_diff>
--- a/docs/Brugervejledning.docx
+++ b/docs/Brugervejledning.docx
@@ -2377,7 +2377,21 @@
           <w:rFonts w:ascii="Arial" w:hAnsi="Arial"/>
           <w:sz w:val="22"/>
         </w:rPr>
-        <w:t>Beløbet vises særskilt i prøvekørslen (' (springer)' efter navnet, afsnit 9.1) og i Lønafregning (afsnit 12.2) – ikke som en synlig linje i selve Aktivitetsoversigten.</w:t>
+        <w:t>Beløbet vises særskilt i prøvekørslen (' (springer)' efter navnet, afsnit 9.1), som egen linje i Lønkørsel-fanens medarbejderkort og i PDF-timesedlen (afsnit 9.4), samt i Lønafregning (afsnit 12.2).</w:t>
+      </w:r>
+    </w:p>
+    <w:p>
+      <w:pPr>
+        <w:pStyle w:val="ListBullet"/>
+        <w:spacing w:after="40"/>
+        <w:ind w:left="454"/>
+      </w:pPr>
+      <w:r>
+        <w:rPr>
+          <w:rFonts w:ascii="Arial" w:hAnsi="Arial"/>
+          <w:sz w:val="22"/>
+        </w:rPr>
+        <w:t>Sætter du fluebenet, og der derefter oprettes en ny aktivitet for medarbejderen (fx via import eller manuel oprettelse), forbliver fluebenet sat – det bliver ikke nulstillet ved en gentegning af aktivitetsoversigten (rettet 2026-09-22).</w:t>
       </w:r>
     </w:p>
     <w:p>
@@ -3172,6 +3186,29 @@
           <w:color w:val="2E6DB8"/>
           <w:sz w:val="22"/>
         </w:rPr>
+        <w:t xml:space="preserve">TIP: </w:t>
+      </w:r>
+      <w:r>
+        <w:rPr>
+          <w:rFonts w:ascii="Arial" w:hAnsi="Arial"/>
+          <w:color w:val="606060"/>
+          <w:sz w:val="22"/>
+        </w:rPr>
+        <w:t>Vognnummer-feltets søgeliste kan siden 2026-09-17 betjenes med tastaturet: Pil ned/Tab flytter markeringen ned i listen (Shift+Tab/Pil op flytter op), Enter vælger det markerede køretøj, og Escape lukker listen igen.</w:t>
+      </w:r>
+    </w:p>
+    <w:p>
+      <w:pPr>
+        <w:spacing w:before="80" w:after="160"/>
+        <w:ind w:left="283" w:right="283"/>
+      </w:pPr>
+      <w:r>
+        <w:rPr>
+          <w:rFonts w:ascii="Arial" w:hAnsi="Arial"/>
+          <w:b/>
+          <w:color w:val="2E6DB8"/>
+          <w:sz w:val="22"/>
+        </w:rPr>
         <w:t xml:space="preserve">BEMÆRK: </w:t>
       </w:r>
       <w:r>
@@ -3250,6 +3287,20 @@
           <w:sz w:val="22"/>
         </w:rPr>
         <w:t>Ferie, sygdom, feriefri m.fl.: starttidspunktet sættes automatisk til 06:00, og sluttidspunktet beregnes ud fra medarbejderens normaltimer den pågældende dag. Vælger du 'Til dato' for at oprette en periode, oprettes én aktivitet PR. HVERDAG i perioden (ikke én sammenhængende aktivitet) – hver dag tæller sine egne normaltimer (typisk 7,4 t).</w:t>
+      </w:r>
+    </w:p>
+    <w:p>
+      <w:pPr>
+        <w:pStyle w:val="ListBullet"/>
+        <w:spacing w:after="40"/>
+        <w:ind w:left="454"/>
+      </w:pPr>
+      <w:r>
+        <w:rPr>
+          <w:rFonts w:ascii="Arial" w:hAnsi="Arial"/>
+          <w:sz w:val="22"/>
+        </w:rPr>
+        <w:t>Selvbetalt fridag og Løn andet sted fra kan siden 2026-09-22 også oprettes som en periode ('Til dato' udfyldt), på nøjagtig samme måde som Ferie – én aktivitet pr. hverdag i intervallet.</w:t>
       </w:r>
     </w:p>
     <w:p>
@@ -3446,6 +3497,48 @@
                 <w:sz w:val="20"/>
               </w:rPr>
               <w:t>Registrerer fridag.</w:t>
+            </w:r>
+          </w:p>
+        </w:tc>
+      </w:tr>
+      <w:tr>
+        <w:tc>
+          <w:tcPr>
+            <w:tcW w:type="dxa" w:w="4536"/>
+            <w:tcBorders>
+              <w:top w:val="single" w:sz="4" w:color="CCCCCC"/>
+              <w:left w:val="single" w:sz="4" w:color="CCCCCC"/>
+              <w:bottom w:val="single" w:sz="4" w:color="CCCCCC"/>
+              <w:right w:val="single" w:sz="4" w:color="CCCCCC"/>
+            </w:tcBorders>
+          </w:tcPr>
+          <w:p>
+            <w:r>
+              <w:rPr>
+                <w:rFonts w:ascii="Arial" w:hAnsi="Arial"/>
+                <w:sz w:val="20"/>
+              </w:rPr>
+              <w:t>Løn andet sted fra</w:t>
+            </w:r>
+          </w:p>
+        </w:tc>
+        <w:tc>
+          <w:tcPr>
+            <w:tcW w:type="dxa" w:w="4536"/>
+            <w:tcBorders>
+              <w:top w:val="single" w:sz="4" w:color="CCCCCC"/>
+              <w:left w:val="single" w:sz="4" w:color="CCCCCC"/>
+              <w:bottom w:val="single" w:sz="4" w:color="CCCCCC"/>
+              <w:right w:val="single" w:sz="4" w:color="CCCCCC"/>
+            </w:tcBorders>
+          </w:tcPr>
+          <w:p>
+            <w:r>
+              <w:rPr>
+                <w:rFonts w:ascii="Arial" w:hAnsi="Arial"/>
+                <w:sz w:val="20"/>
+              </w:rPr>
+              <w:t>Tilføjet 2026-09-22. Fungerer som Selvbetalt fridag (0 kr., ingen linje i Danløn CSV) – bruges som en kommentar til lønbogholderne om, at dagen bevidst er korrekt uden data i dette system, fx fordi medarbejderen har kørt eksport/for et andet selskab den dag.</w:t>
             </w:r>
           </w:p>
         </w:tc>
@@ -6573,7 +6666,7 @@
           <w:rFonts w:ascii="Arial" w:hAnsi="Arial"/>
           <w:sz w:val="22"/>
         </w:rPr>
-        <w:t>CSV-filen downloades til din computer.</w:t>
+        <w:t>CSV-filen downloades til din computer. Filnavnet er (siden 2026-09-22) på formen 'danloen, Lønuge 23-24, 01-06-2026-14-06-2026.csv' – lønuge-numrene og datointervallet for den kørte periode.</w:t>
       </w:r>
     </w:p>
     <w:p>
@@ -7419,8 +7512,73 @@
           </w:p>
         </w:tc>
       </w:tr>
+      <w:tr>
+        <w:tc>
+          <w:tcPr>
+            <w:tcW w:type="dxa" w:w="4536"/>
+            <w:tcBorders>
+              <w:top w:val="single" w:sz="4" w:color="CCCCCC"/>
+              <w:left w:val="single" w:sz="4" w:color="CCCCCC"/>
+              <w:bottom w:val="single" w:sz="4" w:color="CCCCCC"/>
+              <w:right w:val="single" w:sz="4" w:color="CCCCCC"/>
+            </w:tcBorders>
+          </w:tcPr>
+          <w:p>
+            <w:r>
+              <w:rPr>
+                <w:rFonts w:ascii="Arial" w:hAnsi="Arial"/>
+                <w:sz w:val="20"/>
+              </w:rPr>
+              <w:t>Springertillæg</w:t>
+            </w:r>
+          </w:p>
+        </w:tc>
+        <w:tc>
+          <w:tcPr>
+            <w:tcW w:type="dxa" w:w="4536"/>
+            <w:tcBorders>
+              <w:top w:val="single" w:sz="4" w:color="CCCCCC"/>
+              <w:left w:val="single" w:sz="4" w:color="CCCCCC"/>
+              <w:bottom w:val="single" w:sz="4" w:color="CCCCCC"/>
+              <w:right w:val="single" w:sz="4" w:color="CCCCCC"/>
+            </w:tcBorders>
+          </w:tcPr>
+          <w:p>
+            <w:r>
+              <w:rPr>
+                <w:rFonts w:ascii="Arial" w:hAnsi="Arial"/>
+                <w:sz w:val="20"/>
+              </w:rPr>
+              <w:t>Samme timetal som Normal løn, kun for medarbejdere med springertillæg-fluebenet sat for perioden (afsnit 4.5). Sats fra Stamdata (Tillæg-fanen).</w:t>
+            </w:r>
+          </w:p>
+        </w:tc>
+      </w:tr>
     </w:tbl>
     <w:p/>
+    <w:p>
+      <w:pPr>
+        <w:spacing w:before="80" w:after="160"/>
+        <w:ind w:left="283" w:right="283"/>
+      </w:pPr>
+      <w:r>
+        <w:rPr>
+          <w:rFonts w:ascii="Arial" w:hAnsi="Arial"/>
+          <w:b/>
+          <w:color w:val="2E6DB8"/>
+          <w:sz w:val="22"/>
+        </w:rPr>
+        <w:t xml:space="preserve">GODT AT VIDE: </w:t>
+      </w:r>
+      <w:r>
+        <w:rPr>
+          <w:rFonts w:ascii="Arial" w:hAnsi="Arial"/>
+          <w:color w:val="606060"/>
+          <w:sz w:val="22"/>
+        </w:rPr>
+        <w:t>Rettet 2026-09-22: 'I alt'-beløbet pr. medarbejder i Lønkørsel-fanen og i PDF-timesedlens LØNOPSUMMERING medregner nu også fraværstyper med et beregnet beløb (Sygdom, §56 syg, Barn 1.sygedag u. løn, Feriefri, Barsel, Skole/kursus – samme typer som i Lønafregningen, afsnit 12.1). Tidligere manglede disse i selve 'I alt'-summen, selvom de altid har talt korrekt med i den eksporterede Danløn CSV. PDF-timesedlens fraværslinjer viser nu desuden sats og beløb i stedet for '–', så beløbet i 'I alt' på timesedlen stemmer overens med det medarbejderen reelt får udbetalt.</w:t>
+      </w:r>
+    </w:p>
     <w:p>
       <w:pPr>
         <w:pStyle w:val="Heading2"/>
@@ -10988,7 +11146,30 @@
           <w:rFonts w:ascii="Arial" w:hAnsi="Arial"/>
           <w:sz w:val="22"/>
         </w:rPr>
-        <w:t>Den øverste tabel 'Total sum for perioden' viser: Grundtimeløn inkl. tillæg, Overtid Timen før, Overtid 1-3 time efter og Øvrig overtid, efterfulgt af delsummen 'Total uden fravær'. Herunder følger op til 11 fraværstyper (Sygdom, Sygdom u. 8 uger, Barn 1.sygedag, Barn 1.sygedag u. 8 uger, Graviditetsbetinget sygdom, §56 syg, Barsel, Feriefri, Ferie, Skole/kursus og Afspadsering) og til sidst 'Total sum for denne periode'. En linje vises KUN hvis den har et beløb større end 0 kr for den viste periode – har ingen medarbejder fx haft barsel, udelades 'Barsel'-linjen helt.</w:t>
+        <w:t>Den øverste tabel 'Total sum for perioden' viser: Grundtimeløn inkl. tillæg, Overtid Timen før, Overtid 1-3 time efter og Øvrig overtid, efterfulgt af delsummen 'Total uden fravær'. Herefter følger Salttillæg, Overnatning og DOB Overnatning (hver med antal forekomster i parentes, fx 'Overnatning (3 gange)') og op til 11 fraværstyper (Sygdom, Sygdom u. 8 uger, Barn 1.sygedag, Barn 1.sygedag u. 8 uger, Graviditetsbetinget sygdom, §56 syg, Barsel, Feriefri, Ferie, Skole/kursus og Afspadsering), og til sidst 'Total sum for denne periode'. En linje vises KUN hvis den har et beløb større end 0 kr for den viste periode – har ingen medarbejder fx haft barsel, udelades 'Barsel'-linjen helt.</w:t>
+      </w:r>
+    </w:p>
+    <w:p>
+      <w:pPr>
+        <w:spacing w:before="80" w:after="160"/>
+        <w:ind w:left="283" w:right="283"/>
+      </w:pPr>
+      <w:r>
+        <w:rPr>
+          <w:rFonts w:ascii="Arial" w:hAnsi="Arial"/>
+          <w:b/>
+          <w:color w:val="2E6DB8"/>
+          <w:sz w:val="22"/>
+        </w:rPr>
+        <w:t xml:space="preserve">GODT AT VIDE: </w:t>
+      </w:r>
+      <w:r>
+        <w:rPr>
+          <w:rFonts w:ascii="Arial" w:hAnsi="Arial"/>
+          <w:color w:val="606060"/>
+          <w:sz w:val="22"/>
+        </w:rPr>
+        <w:t>Rettet 2026-09-21: Overnatning og DOB Overnatning talte tidligere IKKE med i 'Total sum for denne periode' eller i den enkelte medarbejders samlede løn i denne fane – kun i Lønkørsel-fanen og PDF-timesedlen. Beløbene indgår nu korrekt begge steder.</w:t>
       </w:r>
     </w:p>
     <w:p>
@@ -11243,7 +11424,7 @@
           <w:rFonts w:ascii="Arial" w:hAnsi="Arial"/>
           <w:sz w:val="22"/>
         </w:rPr>
-        <w:t>Nederst i hver medarbejders tabel står 'Total løn for [navn]' – den fulde sum for medarbejderen i perioden: arbejdstid, overtid, salttillæg, springertillæg OG al fraværsbetaling med et beregnet beløb (se afsnit 12.1 for hvilke typer det gælder).</w:t>
+        <w:t>Nederst i hver medarbejders tabel står 'Total løn for [navn]' – den fulde sum for medarbejderen i perioden: arbejdstid, overtid, salttillæg, overnatning, DOB overnatning, springertillæg OG al fraværsbetaling med et beregnet beløb (se afsnit 12.1 for hvilke typer det gælder).</w:t>
       </w:r>
     </w:p>
     <w:p>

</xml_diff>